<commit_message>
Update CVs (GAPF published), add cover letters IO140 & IVADO, thesis remerciements & examinator docs
</commit_message>
<xml_diff>
--- a/CV/neutral/CV_Georges_Parfait_Djimefo_Kapen_AI_Developer.docx
+++ b/CV/neutral/CV_Georges_Parfait_Djimefo_Kapen_AI_Developer.docx
@@ -823,6 +823,15 @@
           <w:sz w:val="19"/>
         </w:rPr>
         <w:t>Energy-Efficient and Near Real-Time Routing Algorithm for Disaster Monitoring in Wireless Sensor Networks</w:t>
+      </w:r>
+      <w:r>
+        <w:rPr>
+          <w:b w:val="0"/>
+          <w:i/>
+          <w:color w:val="007000"/>
+          <w:sz w:val="19"/>
+        </w:rPr>
+        <w:t xml:space="preserve">   (Published)</w:t>
       </w:r>
     </w:p>
     <w:p>

</xml_diff>